<commit_message>
Assign team members to branches and update deliverables
Ahmad Diop -> pki-ejbca-setup, Papa Mamadou -> webserver-https-migration,
Mame Fatou -> docs-rapport-tests. Updated README, repartition-des-taches,
and the generated Word/PPT with real names.
</commit_message>
<xml_diff>
--- a/GROUPE-2/Rapport_PKI_EJBCA_GROUPE-2.docx
+++ b/GROUPE-2/Rapport_PKI_EJBCA_GROUPE-2.docx
@@ -49,11 +49,11 @@
         <w:br/>
         <w:t>Membres :</w:t>
         <w:br/>
-        <w:t>- [Nom membre 1] — Déploiement EJBCA (branche pki-ejbca-setup)</w:t>
+        <w:t>- Ahmad Diop — Déploiement EJBCA (branche pki-ejbca-setup)</w:t>
         <w:br/>
-        <w:t>- [Nom membre 2] — Migration HTTP → HTTPS (branche webserver-https-migration)</w:t>
+        <w:t>- Papa Mamadou — Migration HTTP → HTTPS (branche webserver-https-migration)</w:t>
         <w:br/>
-        <w:t>- [Nom membre 3] — Documentation, rapport, tests (branche docs-rapport-tests)</w:t>
+        <w:t>- Mame Fatou — Documentation, rapport, tests (branche docs-rapport-tests)</w:t>
         <w:br/>
         <w:br/>
         <w:t>Date : [à compléter]</w:t>

</xml_diff>

<commit_message>
Rebalance workload: give Mame Fatou substantial hands-on tasks
She now owns: certificate revocation/CRL demo in EJBCA, independent TLS
security audit (testssl.sh/nmap), and the private-vs-public CA
comparison, in addition to compiling the final report/PPT and video.
Ahmad and Papa each write their own report section instead of dumping
all documentation on Mame Fatou.
</commit_message>
<xml_diff>
--- a/GROUPE-2/Rapport_PKI_EJBCA_GROUPE-2.docx
+++ b/GROUPE-2/Rapport_PKI_EJBCA_GROUPE-2.docx
@@ -164,7 +164,17 @@
     </w:p>
     <w:p>
       <w:r>
-        <w:t xml:space="preserve">   6.5 (Bonus) Révocation et CRL</w:t>
+        <w:t xml:space="preserve">   6.5 Révocation et CRL</w:t>
+      </w:r>
+    </w:p>
+    <w:p>
+      <w:r>
+        <w:t xml:space="preserve">   6.6 Audit de sécurité TLS indépendant</w:t>
+      </w:r>
+    </w:p>
+    <w:p>
+      <w:r>
+        <w:t xml:space="preserve">   6.7 Comparatif CA privée vs CA publique</w:t>
       </w:r>
     </w:p>
     <w:p>
@@ -1296,12 +1306,12 @@
         <w:pStyle w:val="Heading2"/>
       </w:pPr>
       <w:r>
-        <w:t>6.5 (Bonus) Révocation et CRL</w:t>
+        <w:t>6.5 Révocation et CRL (réalisé par Mame Fatou)</w:t>
       </w:r>
     </w:p>
     <w:p>
       <w:r>
-        <w:t>Démonstration optionnelle : révocation du certificat serveur dans EJBCA, publication dans la CRL, puis vérification côté client que le certificat révoqué est rejeté.</w:t>
+        <w:t>Révocation du certificat serveur dans EJBCA, publication/rafraîchissement de la CRL, puis vérification côté client que le certificat révoqué est bien rejeté.</w:t>
       </w:r>
     </w:p>
     <w:tbl>
@@ -1329,6 +1339,155 @@
                 <w:color w:val="808080"/>
               </w:rPr>
               <w:t>[ Insérer capture d'écran ici : Révocation du certificat dans l'Admin Web + CRL mise à jour ]</w:t>
+            </w:r>
+          </w:p>
+          <w:p/>
+          <w:p/>
+          <w:p/>
+          <w:p/>
+          <w:p/>
+        </w:tc>
+      </w:tr>
+    </w:tbl>
+    <w:p/>
+    <w:tbl>
+      <w:tblPr>
+        <w:tblW w:type="auto" w:w="0"/>
+        <w:jc w:val="center"/>
+        <w:tblLook w:firstColumn="1" w:firstRow="1" w:lastColumn="0" w:lastRow="0" w:noHBand="0" w:noVBand="1" w:val="04A0"/>
+      </w:tblPr>
+      <w:tblGrid>
+        <w:gridCol w:w="8640"/>
+      </w:tblGrid>
+      <w:tr>
+        <w:tc>
+          <w:tcPr>
+            <w:tcW w:type="dxa" w:w="8504"/>
+            <w:shd w:val="clear" w:color="auto" w:fill="F2F2F2"/>
+          </w:tcPr>
+          <w:p>
+            <w:pPr>
+              <w:jc w:val="center"/>
+            </w:pPr>
+            <w:r>
+              <w:rPr>
+                <w:i/>
+                <w:color w:val="808080"/>
+              </w:rPr>
+              <w:t>[ Insérer capture d'écran ici : Vérification côté client (openssl verify -crl_check ou tentative de connexion rejetée) ]</w:t>
+            </w:r>
+          </w:p>
+          <w:p/>
+          <w:p/>
+          <w:p/>
+          <w:p/>
+          <w:p/>
+        </w:tc>
+      </w:tr>
+    </w:tbl>
+    <w:p/>
+    <w:p>
+      <w:pPr>
+        <w:pStyle w:val="Heading2"/>
+      </w:pPr>
+      <w:r>
+        <w:t>6.6 Audit de sécurité TLS indépendant (réalisé par Mame Fatou)</w:t>
+      </w:r>
+    </w:p>
+    <w:p>
+      <w:r>
+        <w:t>Audit du serveur web migré, mené indépendamment de la personne qui l'a configuré, avec testssl.sh et/ou nmap, afin de vérifier objectivement les protocoles et suites cryptographiques réellement acceptés.</w:t>
+      </w:r>
+    </w:p>
+    <w:p>
+      <w:r>
+        <w:rPr>
+          <w:rFonts w:ascii="Consolas" w:hAnsi="Consolas"/>
+        </w:rPr>
+        <w:t>testssl.sh https://pki-demo.local</w:t>
+        <w:br/>
+        <w:t>nmap --script ssl-enum-ciphers -p 443 pki-demo.local</w:t>
+      </w:r>
+    </w:p>
+    <w:tbl>
+      <w:tblPr>
+        <w:tblW w:type="auto" w:w="0"/>
+        <w:jc w:val="center"/>
+        <w:tblLook w:firstColumn="1" w:firstRow="1" w:lastColumn="0" w:lastRow="0" w:noHBand="0" w:noVBand="1" w:val="04A0"/>
+      </w:tblPr>
+      <w:tblGrid>
+        <w:gridCol w:w="8640"/>
+      </w:tblGrid>
+      <w:tr>
+        <w:tc>
+          <w:tcPr>
+            <w:tcW w:type="dxa" w:w="8504"/>
+            <w:shd w:val="clear" w:color="auto" w:fill="F2F2F2"/>
+          </w:tcPr>
+          <w:p>
+            <w:pPr>
+              <w:jc w:val="center"/>
+            </w:pPr>
+            <w:r>
+              <w:rPr>
+                <w:i/>
+                <w:color w:val="808080"/>
+              </w:rPr>
+              <w:t>[ Insérer capture d'écran ici : Résultat testssl.sh / nmap ssl-enum-ciphers ]</w:t>
+            </w:r>
+          </w:p>
+          <w:p/>
+          <w:p/>
+          <w:p/>
+          <w:p/>
+          <w:p/>
+        </w:tc>
+      </w:tr>
+    </w:tbl>
+    <w:p/>
+    <w:p>
+      <w:r>
+        <w:t>[Analyse : protocoles/ciphers acceptés, éventuelles faiblesses, recommandations]</w:t>
+      </w:r>
+    </w:p>
+    <w:p>
+      <w:pPr>
+        <w:pStyle w:val="Heading2"/>
+      </w:pPr>
+      <w:r>
+        <w:t>6.7 Comparatif CA privée vs CA publique (réalisé par Mame Fatou)</w:t>
+      </w:r>
+    </w:p>
+    <w:p>
+      <w:r>
+        <w:t>Comparaison du comportement du navigateur/curl face à un site utilisant une CA publique reconnue (ex. https://google.com) et face à notre site utilisant la CA privée EJBCA, afin d'illustrer concrètement le rôle des magasins de confiance système.</w:t>
+      </w:r>
+    </w:p>
+    <w:tbl>
+      <w:tblPr>
+        <w:tblW w:type="auto" w:w="0"/>
+        <w:jc w:val="center"/>
+        <w:tblLook w:firstColumn="1" w:firstRow="1" w:lastColumn="0" w:lastRow="0" w:noHBand="0" w:noVBand="1" w:val="04A0"/>
+      </w:tblPr>
+      <w:tblGrid>
+        <w:gridCol w:w="8640"/>
+      </w:tblGrid>
+      <w:tr>
+        <w:tc>
+          <w:tcPr>
+            <w:tcW w:type="dxa" w:w="8504"/>
+            <w:shd w:val="clear" w:color="auto" w:fill="F2F2F2"/>
+          </w:tcPr>
+          <w:p>
+            <w:pPr>
+              <w:jc w:val="center"/>
+            </w:pPr>
+            <w:r>
+              <w:rPr>
+                <w:i/>
+                <w:color w:val="808080"/>
+              </w:rPr>
+              <w:t>[ Insérer capture d'écran ici : curl -v https://google.com (CA publique, confiance automatique) vs notre site ]</w:t>
             </w:r>
           </w:p>
           <w:p/>

</xml_diff>

<commit_message>
fix: correct team member name Mame Fatou -> Mame Fama
</commit_message>
<xml_diff>
--- a/GROUPE-2/Rapport_PKI_EJBCA_GROUPE-2.docx
+++ b/GROUPE-2/Rapport_PKI_EJBCA_GROUPE-2.docx
@@ -53,7 +53,7 @@
         <w:br/>
         <w:t>- Papa Mamadou — Migration HTTP → HTTPS (branche webserver-https-migration)</w:t>
         <w:br/>
-        <w:t>- Mame Fatou — Documentation, rapport, tests (branche docs-rapport-tests)</w:t>
+        <w:t>- Mame Fama — Documentation, rapport, tests (branche docs-rapport-tests)</w:t>
         <w:br/>
         <w:br/>
         <w:t>Date : [à compléter]</w:t>
@@ -1306,7 +1306,7 @@
         <w:pStyle w:val="Heading2"/>
       </w:pPr>
       <w:r>
-        <w:t>6.5 Révocation et CRL (réalisé par Mame Fatou)</w:t>
+        <w:t>6.5 Révocation et CRL (réalisé par Mame Fama)</w:t>
       </w:r>
     </w:p>
     <w:p>
@@ -1391,7 +1391,7 @@
         <w:pStyle w:val="Heading2"/>
       </w:pPr>
       <w:r>
-        <w:t>6.6 Audit de sécurité TLS indépendant (réalisé par Mame Fatou)</w:t>
+        <w:t>6.6 Audit de sécurité TLS indépendant (réalisé par Mame Fama)</w:t>
       </w:r>
     </w:p>
     <w:p>
@@ -1455,7 +1455,7 @@
         <w:pStyle w:val="Heading2"/>
       </w:pPr>
       <w:r>
-        <w:t>6.7 Comparatif CA privée vs CA publique (réalisé par Mame Fatou)</w:t>
+        <w:t>6.7 Comparatif CA privée vs CA publique (réalisé par Mame Fama)</w:t>
       </w:r>
     </w:p>
     <w:p>

</xml_diff>